<commit_message>
updated the ui and rules
</commit_message>
<xml_diff>
--- a/docs/Sales-Core-Guide.docx
+++ b/docs/Sales-Core-Guide.docx
@@ -5,10 +5,6 @@
     <w:p>
       <w:pPr>
         <w:spacing w:before="2400" w:after="120"/>
-      </w:pPr>
-      <w:bookmarkStart w:id="0" w:name="_GoBack"/>
-      <w:bookmarkEnd w:id="0"/>
-      <w:r>
         <w:rPr>
           <w:b/>
           <w:bCs/>
@@ -17,6 +13,21 @@
           <w:sz w:val="24"/>
           <w:szCs w:val="24"/>
         </w:rPr>
+      </w:pPr>
+    </w:p>
+    <w:p>
+      <w:pPr>
+        <w:spacing w:before="2400" w:after="120"/>
+      </w:pPr>
+      <w:r>
+        <w:rPr>
+          <w:b/>
+          <w:bCs/>
+          <w:color w:val="B25F0D"/>
+          <w:spacing w:val="60"/>
+          <w:sz w:val="24"/>
+          <w:szCs w:val="24"/>
+        </w:rPr>
         <w:t>SALES CORE</w:t>
       </w:r>
     </w:p>
@@ -49,7 +60,7 @@
     </w:p>
     <w:tbl>
       <w:tblPr>
-        <w:tblW w:w="9638" w:type="dxa"/>
+        <w:tblW w:w="9088" w:type="dxa"/>
         <w:tblBorders>
           <w:top w:val="single" w:sz="4" w:space="0" w:color="auto"/>
           <w:left w:val="single" w:sz="4" w:space="0" w:color="auto"/>
@@ -61,14 +72,18 @@
         <w:tblLook w:val="04A0" w:firstRow="1" w:lastRow="0" w:firstColumn="1" w:lastColumn="0" w:noHBand="0" w:noVBand="1"/>
       </w:tblPr>
       <w:tblGrid>
-        <w:gridCol w:w="9638"/>
+        <w:gridCol w:w="9088"/>
       </w:tblGrid>
       <w:tr>
-        <w:tc>
-          <w:tcPr>
-            <w:tcW w:w="9638" w:type="dxa"/>
+        <w:trPr>
+          <w:trHeight w:val="292"/>
+        </w:trPr>
+        <w:tc>
+          <w:tcPr>
+            <w:tcW w:w="9088" w:type="dxa"/>
             <w:tcBorders>
               <w:left w:val="single" w:sz="24" w:space="0" w:color="0A7A6A"/>
+              <w:bottom w:val="nil"/>
             </w:tcBorders>
             <w:shd w:val="clear" w:color="auto" w:fill="DBF1EC"/>
             <w:tcMar>
@@ -78,35 +93,21 @@
               <w:right w:w="200" w:type="dxa"/>
             </w:tcMar>
           </w:tcPr>
-          <w:p>
-            <w:r>
-              <w:rPr>
-                <w:b/>
-                <w:bCs/>
-              </w:rPr>
-              <w:t xml:space="preserve">About this guide: </w:t>
-            </w:r>
-            <w:r>
-              <w:t xml:space="preserve">No technical knowledge is needed to read this guide. Words in </w:t>
-            </w:r>
-            <w:r>
-              <w:rPr>
-                <w:b/>
-                <w:bCs/>
-              </w:rPr>
-              <w:t>bold</w:t>
-            </w:r>
-            <w:r>
-              <w:t xml:space="preserve"> are the names you will see on screen.</w:t>
-            </w:r>
-          </w:p>
+          <w:p/>
         </w:tc>
       </w:tr>
     </w:tbl>
     <w:p>
+      <w:pPr>
+        <w:pBdr>
+          <w:bottom w:val="single" w:sz="4" w:space="1" w:color="auto"/>
+        </w:pBdr>
+      </w:pPr>
       <w:r>
         <w:br w:type="page"/>
       </w:r>
+      <w:bookmarkStart w:id="0" w:name="_GoBack"/>
+      <w:bookmarkEnd w:id="0"/>
     </w:p>
     <w:p>
       <w:pPr>
@@ -1510,10 +1511,7 @@
         <w:spacing w:after="120" w:line="300" w:lineRule="auto"/>
       </w:pPr>
       <w:r>
-        <w:t>Sales Cor</w:t>
-      </w:r>
-      <w:r>
-        <w:t xml:space="preserve">e is a team of </w:t>
+        <w:t xml:space="preserve">Sales Core is a team of </w:t>
       </w:r>
       <w:r>
         <w:rPr>
@@ -1523,10 +1521,15 @@
         <w:t>AI helpers (called agents)</w:t>
       </w:r>
       <w:r>
-        <w:t xml:space="preserve"> that does much of a sales team's everyday work for your company. It finds the right customers, writes messages and posters, answers customer questions on WhatsApp, makes price quotes from your own price list, remin</w:t>
-      </w:r>
-      <w:r>
-        <w:t>ds people to follow up, and shows you the results.</w:t>
+        <w:t xml:space="preserve"> that does much of a sales team's everyday work for your company. It finds the right customers, writes messages and posters, answers customer questions on </w:t>
+      </w:r>
+      <w:proofErr w:type="spellStart"/>
+      <w:r>
+        <w:t>WhatsApp</w:t>
+      </w:r>
+      <w:proofErr w:type="spellEnd"/>
+      <w:r>
+        <w:t>, makes price quotes from your own price list, reminds people to follow up, and shows you the results.</w:t>
       </w:r>
     </w:p>
     <w:p>
@@ -1541,10 +1544,7 @@
         <w:t>You stay in control.</w:t>
       </w:r>
       <w:r>
-        <w:t xml:space="preserve"> Anything important - a big discount, a large order, a campaign going out to customers - waits for a person to approve it. The agents never invent prices: every price comes from your co</w:t>
-      </w:r>
-      <w:r>
-        <w:t>mpany's own catalogue.</w:t>
+        <w:t xml:space="preserve"> Anything important - a big discount, a large order, a campaign going out to customers - waits for a person to approve it. The agents never invent prices: every price comes from your company's own catalogue.</w:t>
       </w:r>
     </w:p>
     <w:p>
@@ -1574,7 +1574,15 @@
         <w:t>Answers customers instantly</w:t>
       </w:r>
       <w:r>
-        <w:t>, day and night, on WhatsApp or email.</w:t>
+        <w:t xml:space="preserve">, day and night, on </w:t>
+      </w:r>
+      <w:proofErr w:type="spellStart"/>
+      <w:r>
+        <w:t>WhatsApp</w:t>
+      </w:r>
+      <w:proofErr w:type="spellEnd"/>
+      <w:r>
+        <w:t xml:space="preserve"> or email.</w:t>
       </w:r>
     </w:p>
     <w:p>
@@ -1614,10 +1622,15 @@
         <w:t>Runs marketing campaigns</w:t>
       </w:r>
       <w:r>
-        <w:t>: picks who to mes</w:t>
-      </w:r>
-      <w:r>
-        <w:t>sage, writes the message, designs a poster.</w:t>
+        <w:t xml:space="preserve">: picks who to message, writes the message, </w:t>
+      </w:r>
+      <w:proofErr w:type="gramStart"/>
+      <w:r>
+        <w:t>designs</w:t>
+      </w:r>
+      <w:proofErr w:type="gramEnd"/>
+      <w:r>
+        <w:t xml:space="preserve"> a poster.</w:t>
       </w:r>
     </w:p>
     <w:p>
@@ -1777,10 +1790,7 @@
           </w:tcPr>
           <w:p>
             <w:r>
-              <w:t>Keeps your customer list, their purchases and conversations in one place. W</w:t>
-            </w:r>
-            <w:r>
-              <w:t>orks out who buys often, who has gone quiet, and who is likely to buy.</w:t>
+              <w:t>Keeps your customer list, their purchases and conversations in one place. Works out who buys often, who has gone quiet, and who is likely to buy.</w:t>
             </w:r>
           </w:p>
         </w:tc>
@@ -1932,10 +1942,7 @@
           </w:tcPr>
           <w:p>
             <w:r>
-              <w:t>A per</w:t>
-            </w:r>
-            <w:r>
-              <w:t>son approves campaigns and any quote that goes over your limits. Nothing risky goes out without you.</w:t>
+              <w:t>A person approves campaigns and any quote that goes over your limits. Nothing risky goes out without you.</w:t>
             </w:r>
           </w:p>
         </w:tc>
@@ -1973,7 +1980,15 @@
           </w:tcPr>
           <w:p>
             <w:r>
-              <w:t>Sends approved messages and posters over WhatsApp, email or social media, at the right time.</w:t>
+              <w:t xml:space="preserve">Sends approved messages and posters over </w:t>
+            </w:r>
+            <w:proofErr w:type="spellStart"/>
+            <w:r>
+              <w:t>WhatsApp</w:t>
+            </w:r>
+            <w:proofErr w:type="spellEnd"/>
+            <w:r>
+              <w:t>, email or social media, at the right time.</w:t>
             </w:r>
           </w:p>
         </w:tc>
@@ -2011,10 +2026,7 @@
           </w:tcPr>
           <w:p>
             <w:r>
-              <w:t>Replies to customers' questions, gives</w:t>
-            </w:r>
-            <w:r>
-              <w:t xml:space="preserve"> prices, makes quotes, and hands the chat to a person when needed.</w:t>
+              <w:t>Replies to customers' questions, gives prices, makes quotes, and hands the chat to a person when needed.</w:t>
             </w:r>
           </w:p>
         </w:tc>
@@ -2104,7 +2116,15 @@
               <w:t xml:space="preserve">Tip: </w:t>
             </w:r>
             <w:r>
-              <w:t>Each agent (except Data, Verification and Approval) can be switched off. For example, a company that only wants WhatsApp replies can run just the Response agent.</w:t>
+              <w:t xml:space="preserve">Each agent (except Data, Verification and Approval) can be switched off. For example, a company that only wants </w:t>
+            </w:r>
+            <w:proofErr w:type="spellStart"/>
+            <w:r>
+              <w:t>WhatsApp</w:t>
+            </w:r>
+            <w:proofErr w:type="spellEnd"/>
+            <w:r>
+              <w:t xml:space="preserve"> replies can run just the Response agent.</w:t>
             </w:r>
           </w:p>
         </w:tc>
@@ -2135,10 +2155,7 @@
         <w:t>company name</w:t>
       </w:r>
       <w:r>
-        <w:t xml:space="preserve"> on the</w:t>
-      </w:r>
-      <w:r>
-        <w:t xml:space="preserve"> left and the sign-in form on the right. Enter your email and password and click </w:t>
+        <w:t xml:space="preserve"> on the left and the sign-in form on the right. Enter your email and password and click </w:t>
       </w:r>
       <w:r>
         <w:rPr>
@@ -2260,7 +2277,15 @@
           </w:tcPr>
           <w:p>
             <w:r>
-              <w:t>Everything: answer customers, approve quotes and campaigns, see all analytics, change agent rules and limits, connect WhatsApp, and add or remove team members.</w:t>
+              <w:t xml:space="preserve">Everything: answer customers, approve quotes and campaigns, see all analytics, change agent rules and limits, connect </w:t>
+            </w:r>
+            <w:proofErr w:type="spellStart"/>
+            <w:r>
+              <w:t>WhatsApp</w:t>
+            </w:r>
+            <w:proofErr w:type="spellEnd"/>
+            <w:r>
+              <w:t>, and add or remove team members.</w:t>
             </w:r>
           </w:p>
         </w:tc>
@@ -2298,10 +2323,15 @@
           </w:tcPr>
           <w:p>
             <w:r>
-              <w:t xml:space="preserve">Daily work: conversations, quotes, campaigns, approvals and analytics. Cannot change </w:t>
-            </w:r>
-            <w:r>
-              <w:t>limits, agent rules, WhatsApp details or the team.</w:t>
+              <w:t xml:space="preserve">Daily work: conversations, quotes, campaigns, approvals and analytics. Cannot change limits, agent rules, </w:t>
+            </w:r>
+            <w:proofErr w:type="spellStart"/>
+            <w:r>
+              <w:t>WhatsApp</w:t>
+            </w:r>
+            <w:proofErr w:type="spellEnd"/>
+            <w:r>
+              <w:t xml:space="preserve"> details or the team.</w:t>
             </w:r>
           </w:p>
         </w:tc>
@@ -2599,8 +2629,13 @@
       <w:pPr>
         <w:spacing w:after="120" w:line="300" w:lineRule="auto"/>
       </w:pPr>
-      <w:r>
-        <w:t>Your starting point each day. It shows the AI team working together, what is waiting for you, a live list of what the agents just did, the campaigns Strategy suggests, and short notes from the Analytics agent.</w:t>
+      <w:proofErr w:type="gramStart"/>
+      <w:r>
+        <w:t>Your</w:t>
+      </w:r>
+      <w:proofErr w:type="gramEnd"/>
+      <w:r>
+        <w:t xml:space="preserve"> starting point each day. It shows the AI team working together, what is waiting for you, a live list of what the agents just did, the campaigns Strategy suggests, and short notes from the Analytics agent.</w:t>
       </w:r>
     </w:p>
     <w:p>
@@ -2620,10 +2655,7 @@
         <w:t>Run due follow-ups</w:t>
       </w:r>
       <w:r>
-        <w:t xml:space="preserve"> - se</w:t>
-      </w:r>
-      <w:r>
-        <w:t>nds any follow-up reminders that are due now.</w:t>
+        <w:t xml:space="preserve"> - sends any follow-up reminders that are due now.</w:t>
       </w:r>
     </w:p>
     <w:p>
@@ -2660,11 +2692,13 @@
       <w:pPr>
         <w:spacing w:after="120" w:line="300" w:lineRule="auto"/>
       </w:pPr>
-      <w:r>
-        <w:t>Everything that is waiting for a person. Open each item, read it, and click approve or reject. You can edit a campaign mess</w:t>
-      </w:r>
-      <w:r>
-        <w:t>age before approving it.</w:t>
+      <w:proofErr w:type="gramStart"/>
+      <w:r>
+        <w:t>Everything that is waiting for a person.</w:t>
+      </w:r>
+      <w:proofErr w:type="gramEnd"/>
+      <w:r>
+        <w:t xml:space="preserve"> Open each item, read it, and click approve or reject. You can edit a campaign message before approving it.</w:t>
       </w:r>
     </w:p>
     <w:tbl>
@@ -2924,11 +2958,13 @@
       <w:pPr>
         <w:spacing w:after="120" w:line="300" w:lineRule="auto"/>
       </w:pPr>
-      <w:r>
-        <w:t>Every chat with every customer, in one place. Click a customer on the left to see the whole history: their messages, the agent's replies, quote</w:t>
-      </w:r>
-      <w:r>
-        <w:t>s, and any campaign message or poster you sent them.</w:t>
+      <w:proofErr w:type="gramStart"/>
+      <w:r>
+        <w:t>Every chat with every customer, in one place.</w:t>
+      </w:r>
+      <w:proofErr w:type="gramEnd"/>
+      <w:r>
+        <w:t xml:space="preserve"> Click a customer on the left to see the whole history: their messages, the agent's replies, quotes, and any campaign message or poster you sent them.</w:t>
       </w:r>
     </w:p>
     <w:p>
@@ -2974,10 +3010,7 @@
         <w:t>type your own reply</w:t>
       </w:r>
       <w:r>
-        <w:t xml:space="preserve"> at any time. When a person takes over, the agent stops replying to that customer until yo</w:t>
-      </w:r>
-      <w:r>
-        <w:t>u hand it back.</w:t>
+        <w:t xml:space="preserve"> at any time. When a person takes over, the agent stops replying to that customer until you hand it back.</w:t>
       </w:r>
     </w:p>
     <w:p>
@@ -3045,22 +3078,28 @@
         <w:t>New campaign</w:t>
       </w:r>
       <w:r>
-        <w:t>: build your</w:t>
-      </w:r>
-      <w:r>
-        <w:t xml:space="preserve"> own in three simple steps (below).</w:t>
+        <w:t>: build your own in three simple steps (below).</w:t>
       </w:r>
     </w:p>
     <w:p>
       <w:pPr>
         <w:spacing w:after="120" w:line="300" w:lineRule="auto"/>
       </w:pPr>
-      <w:r>
-        <w:rPr>
-          <w:b/>
-          <w:bCs/>
-        </w:rPr>
-        <w:t>Step 1 - Who gets it.</w:t>
+      <w:proofErr w:type="gramStart"/>
+      <w:r>
+        <w:rPr>
+          <w:b/>
+          <w:bCs/>
+        </w:rPr>
+        <w:t>Step</w:t>
+      </w:r>
+      <w:proofErr w:type="gramEnd"/>
+      <w:r>
+        <w:rPr>
+          <w:b/>
+          <w:bCs/>
+        </w:rPr>
+        <w:t xml:space="preserve"> 1 - Who gets it.</w:t>
       </w:r>
       <w:r>
         <w:t xml:space="preserve"> Tick the boxes for the customers you want. Within one box, any choice counts (Chennai </w:t>
@@ -3083,10 +3122,7 @@
         <w:t>and</w:t>
       </w:r>
       <w:r>
-        <w:t xml:space="preserve"> contractors). The card on the right shows live how many p</w:t>
-      </w:r>
-      <w:r>
-        <w:t>eople will receive it.</w:t>
+        <w:t xml:space="preserve"> contractors). The card on the right shows live how many people will receive it.</w:t>
       </w:r>
     </w:p>
     <w:tbl>
@@ -3286,7 +3322,23 @@
           </w:tcPr>
           <w:p>
             <w:r>
-              <w:t>Website form, Facebook/Instagram ad, IndiaMART, referral</w:t>
+              <w:t>Website form, Facebook/</w:t>
+            </w:r>
+            <w:proofErr w:type="spellStart"/>
+            <w:r>
+              <w:t>Instagram</w:t>
+            </w:r>
+            <w:proofErr w:type="spellEnd"/>
+            <w:r>
+              <w:t xml:space="preserve"> ad, </w:t>
+            </w:r>
+            <w:proofErr w:type="spellStart"/>
+            <w:r>
+              <w:t>IndiaMART</w:t>
+            </w:r>
+            <w:proofErr w:type="spellEnd"/>
+            <w:r>
+              <w:t>, referral</w:t>
             </w:r>
           </w:p>
         </w:tc>
@@ -3422,10 +3474,7 @@
           </w:tcPr>
           <w:p>
             <w:r>
-              <w:t xml:space="preserve">Only people likely </w:t>
-            </w:r>
-            <w:r>
-              <w:t>to buy</w:t>
+              <w:t>Only people likely to buy</w:t>
             </w:r>
           </w:p>
         </w:tc>
@@ -3474,6 +3523,7 @@
       <w:pPr>
         <w:spacing w:after="120" w:line="300" w:lineRule="auto"/>
       </w:pPr>
+      <w:proofErr w:type="gramStart"/>
       <w:r>
         <w:rPr>
           <w:b/>
@@ -3482,6 +3532,7 @@
         <w:lastRenderedPageBreak/>
         <w:t>Step 2 - Message.</w:t>
       </w:r>
+      <w:proofErr w:type="gramEnd"/>
       <w:r>
         <w:t xml:space="preserve"> Choose </w:t>
       </w:r>
@@ -3510,6 +3561,7 @@
       <w:pPr>
         <w:spacing w:after="120" w:line="300" w:lineRule="auto"/>
       </w:pPr>
+      <w:proofErr w:type="gramStart"/>
       <w:r>
         <w:rPr>
           <w:b/>
@@ -3517,6 +3569,7 @@
         </w:rPr>
         <w:t>Step 3 - Picture.</w:t>
       </w:r>
+      <w:proofErr w:type="gramEnd"/>
       <w:r>
         <w:t xml:space="preserve"> Choose </w:t>
       </w:r>
@@ -3548,7 +3601,15 @@
         <w:t>Upload my poster</w:t>
       </w:r>
       <w:r>
-        <w:t xml:space="preserve"> (PNG, JPEG or WebP, up to 5 MB).</w:t>
+        <w:t xml:space="preserve"> (PNG, JPEG or </w:t>
+      </w:r>
+      <w:proofErr w:type="spellStart"/>
+      <w:r>
+        <w:t>WebP</w:t>
+      </w:r>
+      <w:proofErr w:type="spellEnd"/>
+      <w:r>
+        <w:t>, up to 5 MB).</w:t>
       </w:r>
     </w:p>
     <w:p>
@@ -3576,10 +3637,15 @@
         <w:t>Needs you</w:t>
       </w:r>
       <w:r>
-        <w:t xml:space="preserve"> until you approv</w:t>
-      </w:r>
-      <w:r>
-        <w:t>e. Posters go out as a WhatsApp image with the message under it, or as an email attachment.</w:t>
+        <w:t xml:space="preserve"> until you approve. Posters go out as a </w:t>
+      </w:r>
+      <w:proofErr w:type="spellStart"/>
+      <w:r>
+        <w:t>WhatsApp</w:t>
+      </w:r>
+      <w:proofErr w:type="spellEnd"/>
+      <w:r>
+        <w:t xml:space="preserve"> image with the message under it, or as an email attachment.</w:t>
       </w:r>
     </w:p>
     <w:p>
@@ -3596,8 +3662,13 @@
       <w:pPr>
         <w:spacing w:after="120" w:line="300" w:lineRule="auto"/>
       </w:pPr>
-      <w:r>
-        <w:t xml:space="preserve">Your results dashboard. Open it from </w:t>
+      <w:proofErr w:type="gramStart"/>
+      <w:r>
+        <w:t>Your results dashboard.</w:t>
+      </w:r>
+      <w:proofErr w:type="gramEnd"/>
+      <w:r>
+        <w:t xml:space="preserve"> Open it from </w:t>
       </w:r>
       <w:r>
         <w:rPr>
@@ -3614,7 +3685,23 @@
           <w:b/>
           <w:bCs/>
         </w:rPr>
-        <w:t>7 days, 30 days, 90 days or All time</w:t>
+        <w:t xml:space="preserve">7 days, 30 days, 90 days or </w:t>
+      </w:r>
+      <w:proofErr w:type="gramStart"/>
+      <w:r>
+        <w:rPr>
+          <w:b/>
+          <w:bCs/>
+        </w:rPr>
+        <w:t>All</w:t>
+      </w:r>
+      <w:proofErr w:type="gramEnd"/>
+      <w:r>
+        <w:rPr>
+          <w:b/>
+          <w:bCs/>
+        </w:rPr>
+        <w:t xml:space="preserve"> time</w:t>
       </w:r>
       <w:r>
         <w:t>.</w:t>
@@ -3681,15 +3768,7 @@
                 <w:bCs/>
                 <w:color w:val="FFFFFF"/>
               </w:rPr>
-              <w:t>Wh</w:t>
-            </w:r>
-            <w:r>
-              <w:rPr>
-                <w:b/>
-                <w:bCs/>
-                <w:color w:val="FFFFFF"/>
-              </w:rPr>
-              <w:t>at it means</w:t>
+              <w:t>What it means</w:t>
             </w:r>
           </w:p>
         </w:tc>
@@ -3825,8 +3904,13 @@
           </w:tcPr>
           <w:p>
             <w:r>
-              <w:t>How many quotes turned into orders.</w:t>
-            </w:r>
+              <w:t xml:space="preserve">How many quotes turned into </w:t>
+            </w:r>
+            <w:proofErr w:type="gramStart"/>
+            <w:r>
+              <w:t>orders.</w:t>
+            </w:r>
+            <w:proofErr w:type="gramEnd"/>
           </w:p>
         </w:tc>
       </w:tr>
@@ -3911,10 +3995,7 @@
           </w:tcPr>
           <w:p>
             <w:r>
-              <w:t>What your agents d</w:t>
-            </w:r>
-            <w:r>
-              <w:t>id</w:t>
+              <w:t>What your agents did</w:t>
             </w:r>
           </w:p>
         </w:tc>
@@ -3997,9 +4078,19 @@
       <w:pPr>
         <w:spacing w:after="120" w:line="300" w:lineRule="auto"/>
       </w:pPr>
-      <w:r>
-        <w:t>All quotes and orders in one list. Filter by status at the top right.</w:t>
-      </w:r>
+      <w:proofErr w:type="gramStart"/>
+      <w:r>
+        <w:t>All quotes and orders in one list.</w:t>
+      </w:r>
+      <w:proofErr w:type="gramEnd"/>
+      <w:r>
+        <w:t xml:space="preserve"> </w:t>
+      </w:r>
+      <w:proofErr w:type="gramStart"/>
+      <w:r>
+        <w:t>Filter by status at the top right.</w:t>
+      </w:r>
+      <w:proofErr w:type="gramEnd"/>
     </w:p>
     <w:p>
       <w:pPr>
@@ -4013,6 +4104,7 @@
       <w:r>
         <w:t xml:space="preserve">When the customer confirms, click </w:t>
       </w:r>
+      <w:proofErr w:type="gramStart"/>
       <w:r>
         <w:rPr>
           <w:b/>
@@ -4020,9 +4112,11 @@
         </w:rPr>
         <w:t>Won</w:t>
       </w:r>
+      <w:proofErr w:type="gramEnd"/>
       <w:r>
         <w:t xml:space="preserve">. If they decide not to buy, click </w:t>
       </w:r>
+      <w:proofErr w:type="gramStart"/>
       <w:r>
         <w:rPr>
           <w:b/>
@@ -4030,8 +4124,17 @@
         </w:rPr>
         <w:t>Lost</w:t>
       </w:r>
-      <w:r>
-        <w:t>. This also teaches the system who is likely to buy.</w:t>
+      <w:proofErr w:type="gramEnd"/>
+      <w:r>
+        <w:t xml:space="preserve">. This also teaches the system </w:t>
+      </w:r>
+      <w:proofErr w:type="gramStart"/>
+      <w:r>
+        <w:t>who</w:t>
+      </w:r>
+      <w:proofErr w:type="gramEnd"/>
+      <w:r>
+        <w:t xml:space="preserve"> is likely to buy.</w:t>
       </w:r>
     </w:p>
     <w:p>
@@ -4071,14 +4174,7 @@
           <w:b/>
           <w:bCs/>
         </w:rPr>
-        <w:t>₹</w:t>
-      </w:r>
-      <w:r>
-        <w:rPr>
-          <w:b/>
-          <w:bCs/>
-        </w:rPr>
-        <w:t>X due</w:t>
+        <w:t>₹X due</w:t>
       </w:r>
       <w:r>
         <w:t xml:space="preserve"> or </w:t>
@@ -4119,10 +4215,7 @@
         <w:spacing w:after="120" w:line="300" w:lineRule="auto"/>
       </w:pPr>
       <w:r>
-        <w:t>See your AI team and choose what runs. Pick a ready setup (for examp</w:t>
-      </w:r>
-      <w:r>
-        <w:t xml:space="preserve">le </w:t>
+        <w:t xml:space="preserve">See your AI team and choose what runs. Pick a ready setup (for example </w:t>
       </w:r>
       <w:r>
         <w:rPr>
@@ -4415,10 +4508,23 @@
           </w:tcPr>
           <w:p>
             <w:r>
-              <w:t>Automatic (WhatsApp, then email), WhatsApp only, Email only, or Console</w:t>
-            </w:r>
-            <w:r>
-              <w:t xml:space="preserve"> (testing).</w:t>
+              <w:t>Automatic (</w:t>
+            </w:r>
+            <w:proofErr w:type="spellStart"/>
+            <w:r>
+              <w:t>WhatsApp</w:t>
+            </w:r>
+            <w:proofErr w:type="spellEnd"/>
+            <w:r>
+              <w:t xml:space="preserve">, then email), </w:t>
+            </w:r>
+            <w:proofErr w:type="spellStart"/>
+            <w:r>
+              <w:t>WhatsApp</w:t>
+            </w:r>
+            <w:proofErr w:type="spellEnd"/>
+            <w:r>
+              <w:t xml:space="preserve"> only, Email only, or Console (testing).</w:t>
             </w:r>
           </w:p>
         </w:tc>
@@ -4468,17 +4574,27 @@
         <w:pStyle w:val="Heading2"/>
       </w:pPr>
       <w:bookmarkStart w:id="15" w:name="_Toc242269560"/>
+      <w:proofErr w:type="spellStart"/>
       <w:r>
         <w:t>Catalog</w:t>
       </w:r>
       <w:bookmarkEnd w:id="15"/>
+      <w:proofErr w:type="spellEnd"/>
     </w:p>
     <w:p>
       <w:pPr>
         <w:spacing w:after="120" w:line="300" w:lineRule="auto"/>
       </w:pPr>
       <w:r>
-        <w:t xml:space="preserve">Your price list - the only place prices come from. Search it the way a customer would write ("white paint 20 litre"). Use </w:t>
+        <w:t xml:space="preserve">Your price list - the only place prices come from. Search it the way a customer would write ("white paint 20 </w:t>
+      </w:r>
+      <w:proofErr w:type="gramStart"/>
+      <w:r>
+        <w:t>litre</w:t>
+      </w:r>
+      <w:proofErr w:type="gramEnd"/>
+      <w:r>
+        <w:t xml:space="preserve">"). Use </w:t>
       </w:r>
       <w:r>
         <w:rPr>
@@ -4488,10 +4604,15 @@
         <w:t>Import a CSV</w:t>
       </w:r>
       <w:r>
-        <w:t xml:space="preserve"> to load products, customers or p</w:t>
-      </w:r>
-      <w:r>
-        <w:t>ast orders from a spreadsheet; the agents relearn right away.</w:t>
+        <w:t xml:space="preserve"> to load products, customers or past orders from a </w:t>
+      </w:r>
+      <w:proofErr w:type="spellStart"/>
+      <w:r>
+        <w:t>spreadsheet</w:t>
+      </w:r>
+      <w:proofErr w:type="spellEnd"/>
+      <w:r>
+        <w:t>; the agents relearn right away.</w:t>
       </w:r>
     </w:p>
     <w:p>
@@ -4513,6 +4634,7 @@
         </w:numPr>
         <w:spacing w:after="80" w:line="290" w:lineRule="auto"/>
       </w:pPr>
+      <w:proofErr w:type="spellStart"/>
       <w:r>
         <w:rPr>
           <w:b/>
@@ -4520,8 +4642,17 @@
         </w:rPr>
         <w:t>WhatsApp</w:t>
       </w:r>
-      <w:r>
-        <w:t>: paste your Phone number ID and Access token from Meta Business to start sending real WhatsApp messages.</w:t>
+      <w:proofErr w:type="spellEnd"/>
+      <w:r>
+        <w:t xml:space="preserve">: paste your Phone number ID and Access token from Meta Business to start sending real </w:t>
+      </w:r>
+      <w:proofErr w:type="spellStart"/>
+      <w:r>
+        <w:t>WhatsApp</w:t>
+      </w:r>
+      <w:proofErr w:type="spellEnd"/>
+      <w:r>
+        <w:t xml:space="preserve"> messages.</w:t>
       </w:r>
     </w:p>
     <w:p>
@@ -4581,10 +4712,7 @@
         <w:t>Team</w:t>
       </w:r>
       <w:r>
-        <w:t>: add people (name, email, role, first password), change roles, set new passwords, or remove so</w:t>
-      </w:r>
-      <w:r>
-        <w:t>meone.</w:t>
+        <w:t>: add people (name, email, role, first password), change roles, set new passwords, or remove someone.</w:t>
       </w:r>
     </w:p>
     <w:p>
@@ -4632,10 +4760,15 @@
         <w:t>/</w:t>
       </w:r>
       <w:r>
-        <w:t xml:space="preserve"> key) and ask in plain words, for example "Wha</w:t>
-      </w:r>
-      <w:r>
-        <w:t>t needs me today?" or "Who are my hottest leads?". It answers from your live data and can prepare campaign drafts - but it never sends or approves anything by itself.</w:t>
+        <w:t xml:space="preserve"> key) and ask in plain words, for example "What needs me today?" or "Who are my hottest leads?</w:t>
+      </w:r>
+      <w:proofErr w:type="gramStart"/>
+      <w:r>
+        <w:t>".</w:t>
+      </w:r>
+      <w:proofErr w:type="gramEnd"/>
+      <w:r>
+        <w:t xml:space="preserve"> It answers from your live data and can prepare campaign drafts - but it never sends or approves anything by itself.</w:t>
       </w:r>
     </w:p>
     <w:p>
@@ -4670,14 +4803,7 @@
           <w:b/>
           <w:bCs/>
         </w:rPr>
-        <w:t>P</w:t>
-      </w:r>
-      <w:r>
-        <w:rPr>
-          <w:b/>
-          <w:bCs/>
-        </w:rPr>
-        <w:t>rices always come from your catalogue.</w:t>
+        <w:t>Prices always come from your catalogue.</w:t>
       </w:r>
       <w:r>
         <w:t xml:space="preserve"> The AI cannot make up a price.</w:t>
@@ -4763,12 +4889,21 @@
         </w:numPr>
         <w:spacing w:after="80" w:line="290" w:lineRule="auto"/>
       </w:pPr>
-      <w:r>
-        <w:rPr>
-          <w:b/>
-          <w:bCs/>
-        </w:rPr>
-        <w:t>WhatsApp's 24-hour rule</w:t>
+      <w:proofErr w:type="spellStart"/>
+      <w:r>
+        <w:rPr>
+          <w:b/>
+          <w:bCs/>
+        </w:rPr>
+        <w:t>WhatsApp's</w:t>
+      </w:r>
+      <w:proofErr w:type="spellEnd"/>
+      <w:r>
+        <w:rPr>
+          <w:b/>
+          <w:bCs/>
+        </w:rPr>
+        <w:t xml:space="preserve"> 24-hour rule</w:t>
       </w:r>
       <w:r>
         <w:t xml:space="preserve"> is followed: after 24 hours without a customer reply, only Meta-approved templates are used.</w:t>
@@ -4788,14 +4923,7 @@
           <w:b/>
           <w:bCs/>
         </w:rPr>
-        <w:t>If the AI is</w:t>
-      </w:r>
-      <w:r>
-        <w:rPr>
-          <w:b/>
-          <w:bCs/>
-        </w:rPr>
-        <w:t xml:space="preserve"> busy or down</w:t>
+        <w:t>If the AI is busy or down</w:t>
       </w:r>
       <w:r>
         <w:t>, the chat is passed to a person - the customer is never left without an answer.</w:t>
@@ -4815,7 +4943,23 @@
           <w:b/>
           <w:bCs/>
         </w:rPr>
-        <w:t>Every approval records who approved it.</w:t>
+        <w:t xml:space="preserve">Every approval records </w:t>
+      </w:r>
+      <w:proofErr w:type="gramStart"/>
+      <w:r>
+        <w:rPr>
+          <w:b/>
+          <w:bCs/>
+        </w:rPr>
+        <w:t>who</w:t>
+      </w:r>
+      <w:proofErr w:type="gramEnd"/>
+      <w:r>
+        <w:rPr>
+          <w:b/>
+          <w:bCs/>
+        </w:rPr>
+        <w:t xml:space="preserve"> approved it.</w:t>
       </w:r>
     </w:p>
     <w:p>
@@ -4873,18 +5017,24 @@
       <w:r>
         <w:t xml:space="preserve">Open </w:t>
       </w:r>
-      <w:r>
-        <w:rPr>
-          <w:b/>
-          <w:bCs/>
-        </w:rPr>
-        <w:t>Needs you</w:t>
-      </w:r>
-      <w:r>
-        <w:t>. Approve or</w:t>
-      </w:r>
-      <w:r>
-        <w:t xml:space="preserve"> reject quotes and campaigns; reply to hand-offs.</w:t>
+      <w:proofErr w:type="gramStart"/>
+      <w:r>
+        <w:rPr>
+          <w:b/>
+          <w:bCs/>
+        </w:rPr>
+        <w:t>Needs</w:t>
+      </w:r>
+      <w:proofErr w:type="gramEnd"/>
+      <w:r>
+        <w:rPr>
+          <w:b/>
+          <w:bCs/>
+        </w:rPr>
+        <w:t xml:space="preserve"> you</w:t>
+      </w:r>
+      <w:r>
+        <w:t>. Approve or reject quotes and campaigns; reply to hand-offs.</w:t>
       </w:r>
     </w:p>
     <w:p>
@@ -4932,6 +5082,7 @@
       <w:r>
         <w:t xml:space="preserve">, mark quotes </w:t>
       </w:r>
+      <w:proofErr w:type="gramStart"/>
       <w:r>
         <w:rPr>
           <w:b/>
@@ -4939,6 +5090,7 @@
         </w:rPr>
         <w:t>Won</w:t>
       </w:r>
+      <w:proofErr w:type="gramEnd"/>
       <w:r>
         <w:t xml:space="preserve"> or </w:t>
       </w:r>
@@ -4983,10 +5135,7 @@
         <w:t>Marketing</w:t>
       </w:r>
       <w:r>
-        <w:t>, draft one of the Strategy agent's suggestions i</w:t>
-      </w:r>
-      <w:r>
-        <w:t>f it fits this week.</w:t>
+        <w:t>, draft one of the Strategy agent's suggestions if it fits this week.</w:t>
       </w:r>
     </w:p>
     <w:p>
@@ -5050,10 +5199,7 @@
         <w:t>Needs you</w:t>
       </w:r>
       <w:r>
-        <w:t xml:space="preserve"> </w:t>
-      </w:r>
-      <w:r>
-        <w:t>and the customer is told someone will confirm shortly.</w:t>
+        <w:t xml:space="preserve"> and the customer is told someone will confirm shortly.</w:t>
       </w:r>
     </w:p>
     <w:p>
@@ -5073,6 +5219,7 @@
       <w:pPr>
         <w:spacing w:after="120" w:line="300" w:lineRule="auto"/>
       </w:pPr>
+      <w:proofErr w:type="gramStart"/>
       <w:r>
         <w:t xml:space="preserve">In </w:t>
       </w:r>
@@ -5084,7 +5231,11 @@
         <w:t>Conversations</w:t>
       </w:r>
       <w:r>
-        <w:t>. Click the customer: the poster you sent and their reply are in the same chat.</w:t>
+        <w:t>.</w:t>
+      </w:r>
+      <w:proofErr w:type="gramEnd"/>
+      <w:r>
+        <w:t xml:space="preserve"> Click the customer: the poster you sent and their reply are in the same chat.</w:t>
       </w:r>
     </w:p>
     <w:p>
@@ -5118,7 +5269,25 @@
           <w:bCs/>
           <w:color w:val="0A7A6A"/>
         </w:rPr>
-        <w:t>Why are messages not reaching customers' WhatsApp?</w:t>
+        <w:t xml:space="preserve">Why are messages not reaching customers' </w:t>
+      </w:r>
+      <w:proofErr w:type="spellStart"/>
+      <w:r>
+        <w:rPr>
+          <w:b/>
+          <w:bCs/>
+          <w:color w:val="0A7A6A"/>
+        </w:rPr>
+        <w:t>WhatsApp</w:t>
+      </w:r>
+      <w:proofErr w:type="spellEnd"/>
+      <w:r>
+        <w:rPr>
+          <w:b/>
+          <w:bCs/>
+          <w:color w:val="0A7A6A"/>
+        </w:rPr>
+        <w:t>?</w:t>
       </w:r>
     </w:p>
     <w:p>
@@ -5126,7 +5295,15 @@
         <w:spacing w:after="120" w:line="300" w:lineRule="auto"/>
       </w:pPr>
       <w:r>
-        <w:t xml:space="preserve">Sending is in test mode until WhatsApp is connected in </w:t>
+        <w:t xml:space="preserve">Sending is in test mode until </w:t>
+      </w:r>
+      <w:proofErr w:type="spellStart"/>
+      <w:r>
+        <w:t>WhatsApp</w:t>
+      </w:r>
+      <w:proofErr w:type="spellEnd"/>
+      <w:r>
+        <w:t xml:space="preserve"> is connected in </w:t>
       </w:r>
       <w:r>
         <w:rPr>
@@ -5136,10 +5313,7 @@
         <w:t>Settings</w:t>
       </w:r>
       <w:r>
-        <w:t>. Until then, message</w:t>
-      </w:r>
-      <w:r>
-        <w:t>s only show inside the app.</w:t>
+        <w:t>. Until then, messages only show inside the app.</w:t>
       </w:r>
     </w:p>
     <w:p>
@@ -5201,10 +5375,7 @@
         <w:t>Settings &gt; Team</w:t>
       </w:r>
       <w:r>
-        <w:t xml:space="preserve"> and shares the first password with them d</w:t>
-      </w:r>
-      <w:r>
-        <w:t>irectly.</w:t>
+        <w:t xml:space="preserve"> and shares the first password with them directly.</w:t>
       </w:r>
     </w:p>
     <w:p>
@@ -5517,10 +5688,7 @@
           </w:tcPr>
           <w:p>
             <w:r>
-              <w:t>A small group that does not get a campaign, used to measure it</w:t>
-            </w:r>
-            <w:r>
-              <w:t>s real effect.</w:t>
+              <w:t>A small group that does not get a campaign, used to measure its real effect.</w:t>
             </w:r>
           </w:p>
         </w:tc>
@@ -5632,10 +5800,7 @@
         <w:spacing w:after="80" w:line="290" w:lineRule="auto"/>
       </w:pPr>
       <w:r>
-        <w:t>Reading customers'</w:t>
-      </w:r>
-      <w:r>
-        <w:t xml:space="preserve"> email replies inside Conversations.</w:t>
+        <w:t>Reading customers' email replies inside Conversations.</w:t>
       </w:r>
     </w:p>
     <w:p>
@@ -5652,7 +5817,7 @@
       </w:r>
     </w:p>
     <w:sectPr>
-      <w:footerReference w:type="default" r:id="rId8"/>
+      <w:footerReference w:type="default" r:id="rId9"/>
       <w:pgSz w:w="11906" w:h="16838"/>
       <w:pgMar w:top="1134" w:right="1134" w:bottom="1134" w:left="1134" w:header="708" w:footer="708" w:gutter="0"/>
       <w:cols w:space="720"/>
@@ -5726,7 +5891,7 @@
         <w:sz w:val="18"/>
         <w:szCs w:val="18"/>
       </w:rPr>
-      <w:t>9</w:t>
+      <w:t>8</w:t>
     </w:r>
     <w:r>
       <w:rPr>
@@ -6371,6 +6536,33 @@
       <w:ind w:left="220"/>
     </w:pPr>
   </w:style>
+  <w:style w:type="paragraph" w:styleId="BalloonText">
+    <w:name w:val="Balloon Text"/>
+    <w:basedOn w:val="Normal"/>
+    <w:link w:val="BalloonTextChar"/>
+    <w:uiPriority w:val="99"/>
+    <w:semiHidden/>
+    <w:unhideWhenUsed/>
+    <w:rsid w:val="007F2BF1"/>
+    <w:rPr>
+      <w:rFonts w:ascii="Tahoma" w:hAnsi="Tahoma" w:cs="Tahoma"/>
+      <w:sz w:val="16"/>
+      <w:szCs w:val="16"/>
+    </w:rPr>
+  </w:style>
+  <w:style w:type="character" w:customStyle="1" w:styleId="BalloonTextChar">
+    <w:name w:val="Balloon Text Char"/>
+    <w:basedOn w:val="DefaultParagraphFont"/>
+    <w:link w:val="BalloonText"/>
+    <w:uiPriority w:val="99"/>
+    <w:semiHidden/>
+    <w:rsid w:val="007F2BF1"/>
+    <w:rPr>
+      <w:rFonts w:ascii="Tahoma" w:hAnsi="Tahoma" w:cs="Tahoma"/>
+      <w:sz w:val="16"/>
+      <w:szCs w:val="16"/>
+    </w:rPr>
+  </w:style>
 </w:styles>
 </file>
 
@@ -6769,6 +6961,33 @@
       <w:ind w:left="220"/>
     </w:pPr>
   </w:style>
+  <w:style w:type="paragraph" w:styleId="BalloonText">
+    <w:name w:val="Balloon Text"/>
+    <w:basedOn w:val="Normal"/>
+    <w:link w:val="BalloonTextChar"/>
+    <w:uiPriority w:val="99"/>
+    <w:semiHidden/>
+    <w:unhideWhenUsed/>
+    <w:rsid w:val="007F2BF1"/>
+    <w:rPr>
+      <w:rFonts w:ascii="Tahoma" w:hAnsi="Tahoma" w:cs="Tahoma"/>
+      <w:sz w:val="16"/>
+      <w:szCs w:val="16"/>
+    </w:rPr>
+  </w:style>
+  <w:style w:type="character" w:customStyle="1" w:styleId="BalloonTextChar">
+    <w:name w:val="Balloon Text Char"/>
+    <w:basedOn w:val="DefaultParagraphFont"/>
+    <w:link w:val="BalloonText"/>
+    <w:uiPriority w:val="99"/>
+    <w:semiHidden/>
+    <w:rsid w:val="007F2BF1"/>
+    <w:rPr>
+      <w:rFonts w:ascii="Tahoma" w:hAnsi="Tahoma" w:cs="Tahoma"/>
+      <w:sz w:val="16"/>
+      <w:szCs w:val="16"/>
+    </w:rPr>
+  </w:style>
 </w:styles>
 </file>
 
@@ -7060,4 +7279,16 @@
   <a:objectDefaults/>
   <a:extraClrSchemeLst/>
 </a:theme>
+</file>
+
+<file path=customXml/item1.xml><?xml version="1.0" encoding="utf-8"?>
+<b:Sources xmlns:b="http://schemas.openxmlformats.org/officeDocument/2006/bibliography" xmlns="http://schemas.openxmlformats.org/officeDocument/2006/bibliography" SelectedStyle="\APA.XSL" StyleName="APA"/>
+</file>
+
+<file path=customXml/itemProps1.xml><?xml version="1.0" encoding="utf-8"?>
+<ds:datastoreItem xmlns:ds="http://schemas.openxmlformats.org/officeDocument/2006/customXml" ds:itemID="{7488A9CC-A168-4A33-8157-249346E2B1D9}">
+  <ds:schemaRefs>
+    <ds:schemaRef ds:uri="http://schemas.openxmlformats.org/officeDocument/2006/bibliography"/>
+  </ds:schemaRefs>
+</ds:datastoreItem>
 </file>
</xml_diff>